<commit_message>
lab8: Finish exercise 1 and 2
</commit_message>
<xml_diff>
--- a/lab8/lab8_report.docx
+++ b/lab8/lab8_report.docx
@@ -236,6 +236,198 @@
     </w:p>
     <w:p>
       <w:pPr>
+        <w:rPr>
+          <w:rFonts w:ascii="Times New Roman" w:hAnsi="Times New Roman" w:cs="Times New Roman"/>
+          <w:lang w:val="en-GB" w:eastAsia="nb-NO"/>
+        </w:rPr>
+      </w:pPr>
+      <w:r>
+        <w:rPr>
+          <w:rFonts w:ascii="Times New Roman" w:hAnsi="Times New Roman" w:cs="Times New Roman"/>
+          <w:lang w:val="en-GB" w:eastAsia="nb-NO"/>
+        </w:rPr>
+        <w:t>In this exercise I updated the code by replacing</w:t>
+      </w:r>
+      <w:r>
+        <w:rPr>
+          <w:rFonts w:ascii="Times New Roman" w:hAnsi="Times New Roman" w:cs="Times New Roman"/>
+          <w:i/>
+          <w:iCs/>
+          <w:lang w:val="en-GB" w:eastAsia="nb-NO"/>
+        </w:rPr>
+        <w:t xml:space="preserve"> count++ </w:t>
+      </w:r>
+      <w:r>
+        <w:rPr>
+          <w:rFonts w:ascii="Times New Roman" w:hAnsi="Times New Roman" w:cs="Times New Roman"/>
+          <w:lang w:val="en-GB" w:eastAsia="nb-NO"/>
+        </w:rPr>
+        <w:t xml:space="preserve">and </w:t>
+      </w:r>
+      <w:r>
+        <w:rPr>
+          <w:rFonts w:ascii="Times New Roman" w:hAnsi="Times New Roman" w:cs="Times New Roman"/>
+          <w:i/>
+          <w:iCs/>
+          <w:lang w:val="en-GB" w:eastAsia="nb-NO"/>
+        </w:rPr>
+        <w:t>count—</w:t>
+      </w:r>
+      <w:r>
+        <w:rPr>
+          <w:rFonts w:ascii="Times New Roman" w:hAnsi="Times New Roman" w:cs="Times New Roman"/>
+          <w:lang w:val="en-GB" w:eastAsia="nb-NO"/>
+        </w:rPr>
+        <w:t xml:space="preserve"> </w:t>
+      </w:r>
+      <w:r>
+        <w:rPr>
+          <w:rFonts w:ascii="Times New Roman" w:hAnsi="Times New Roman" w:cs="Times New Roman"/>
+          <w:lang w:val="en-GB" w:eastAsia="nb-NO"/>
+        </w:rPr>
+        <w:t xml:space="preserve">with </w:t>
+      </w:r>
+      <w:proofErr w:type="gramStart"/>
+      <w:r>
+        <w:rPr>
+          <w:rFonts w:ascii="Times New Roman" w:hAnsi="Times New Roman" w:cs="Times New Roman"/>
+          <w:lang w:val="en-GB" w:eastAsia="nb-NO"/>
+        </w:rPr>
+        <w:t>Atomic</w:t>
+      </w:r>
+      <w:proofErr w:type="gramEnd"/>
+      <w:r>
+        <w:rPr>
+          <w:rFonts w:ascii="Times New Roman" w:hAnsi="Times New Roman" w:cs="Times New Roman"/>
+          <w:lang w:val="en-GB" w:eastAsia="nb-NO"/>
+        </w:rPr>
+        <w:t xml:space="preserve"> variables such as </w:t>
+      </w:r>
+      <w:proofErr w:type="spellStart"/>
+      <w:r>
+        <w:rPr>
+          <w:rFonts w:ascii="Times New Roman" w:hAnsi="Times New Roman" w:cs="Times New Roman"/>
+          <w:i/>
+          <w:iCs/>
+          <w:lang w:val="en-GB" w:eastAsia="nb-NO"/>
+        </w:rPr>
+        <w:t>incrementAndGet</w:t>
+      </w:r>
+      <w:proofErr w:type="spellEnd"/>
+      <w:r>
+        <w:rPr>
+          <w:rFonts w:ascii="Times New Roman" w:hAnsi="Times New Roman" w:cs="Times New Roman"/>
+          <w:lang w:val="en-GB" w:eastAsia="nb-NO"/>
+        </w:rPr>
+        <w:t xml:space="preserve"> and </w:t>
+      </w:r>
+      <w:proofErr w:type="spellStart"/>
+      <w:r>
+        <w:rPr>
+          <w:rFonts w:ascii="Times New Roman" w:hAnsi="Times New Roman" w:cs="Times New Roman"/>
+          <w:i/>
+          <w:iCs/>
+          <w:lang w:val="en-GB" w:eastAsia="nb-NO"/>
+        </w:rPr>
+        <w:t>decrementAndGet</w:t>
+      </w:r>
+      <w:proofErr w:type="spellEnd"/>
+      <w:r>
+        <w:rPr>
+          <w:rFonts w:ascii="Times New Roman" w:hAnsi="Times New Roman" w:cs="Times New Roman"/>
+          <w:lang w:val="en-GB" w:eastAsia="nb-NO"/>
+        </w:rPr>
+        <w:t xml:space="preserve"> to avoid</w:t>
+      </w:r>
+      <w:r>
+        <w:rPr>
+          <w:rFonts w:ascii="Times New Roman" w:hAnsi="Times New Roman" w:cs="Times New Roman"/>
+          <w:lang w:val="en-GB" w:eastAsia="nb-NO"/>
+        </w:rPr>
+        <w:t xml:space="preserve"> data</w:t>
+      </w:r>
+      <w:r>
+        <w:rPr>
+          <w:rFonts w:ascii="Times New Roman" w:hAnsi="Times New Roman" w:cs="Times New Roman"/>
+          <w:lang w:val="en-GB" w:eastAsia="nb-NO"/>
+        </w:rPr>
+        <w:t xml:space="preserve"> race problems.</w:t>
+      </w:r>
+      <w:r>
+        <w:rPr>
+          <w:rFonts w:ascii="Times New Roman" w:hAnsi="Times New Roman" w:cs="Times New Roman"/>
+          <w:lang w:val="en-GB" w:eastAsia="nb-NO"/>
+        </w:rPr>
+        <w:t xml:space="preserve"> Below is a screenshot of the changed code. It can also be found in the </w:t>
+      </w:r>
+      <w:r>
+        <w:rPr>
+          <w:rFonts w:ascii="Times New Roman" w:hAnsi="Times New Roman" w:cs="Times New Roman"/>
+          <w:i/>
+          <w:iCs/>
+          <w:lang w:val="en-GB" w:eastAsia="nb-NO"/>
+        </w:rPr>
+        <w:t>DataRace.java</w:t>
+      </w:r>
+      <w:r>
+        <w:rPr>
+          <w:rFonts w:ascii="Times New Roman" w:hAnsi="Times New Roman" w:cs="Times New Roman"/>
+          <w:lang w:val="en-GB" w:eastAsia="nb-NO"/>
+        </w:rPr>
+        <w:t xml:space="preserve"> file</w:t>
+      </w:r>
+    </w:p>
+    <w:p>
+      <w:pPr>
+        <w:rPr>
+          <w:rFonts w:ascii="Times New Roman" w:hAnsi="Times New Roman" w:cs="Times New Roman"/>
+          <w:lang w:val="en-GB" w:eastAsia="nb-NO"/>
+        </w:rPr>
+      </w:pPr>
+      <w:r>
+        <w:rPr>
+          <w:rFonts w:ascii="Times New Roman" w:hAnsi="Times New Roman" w:cs="Times New Roman"/>
+          <w:lang w:val="en-GB" w:eastAsia="nb-NO"/>
+        </w:rPr>
+        <w:drawing>
+          <wp:inline distT="0" distB="0" distL="0" distR="0" wp14:anchorId="1646288B" wp14:editId="1C8E1E83">
+            <wp:extent cx="5468113" cy="5982535"/>
+            <wp:effectExtent l="0" t="0" r="0" b="0"/>
+            <wp:docPr id="1462275517" name="Bilde 1"/>
+            <wp:cNvGraphicFramePr>
+              <a:graphicFrameLocks xmlns:a="http://schemas.openxmlformats.org/drawingml/2006/main" noChangeAspect="1"/>
+            </wp:cNvGraphicFramePr>
+            <a:graphic xmlns:a="http://schemas.openxmlformats.org/drawingml/2006/main">
+              <a:graphicData uri="http://schemas.openxmlformats.org/drawingml/2006/picture">
+                <pic:pic xmlns:pic="http://schemas.openxmlformats.org/drawingml/2006/picture">
+                  <pic:nvPicPr>
+                    <pic:cNvPr id="1462275517" name=""/>
+                    <pic:cNvPicPr/>
+                  </pic:nvPicPr>
+                  <pic:blipFill>
+                    <a:blip r:embed="rId7"/>
+                    <a:stretch>
+                      <a:fillRect/>
+                    </a:stretch>
+                  </pic:blipFill>
+                  <pic:spPr>
+                    <a:xfrm>
+                      <a:off x="0" y="0"/>
+                      <a:ext cx="5468113" cy="5982535"/>
+                    </a:xfrm>
+                    <a:prstGeom prst="rect">
+                      <a:avLst/>
+                    </a:prstGeom>
+                  </pic:spPr>
+                </pic:pic>
+              </a:graphicData>
+            </a:graphic>
+          </wp:inline>
+        </w:drawing>
+      </w:r>
+    </w:p>
+    <w:p>
+      <w:pPr>
         <w:keepNext/>
         <w:keepLines/>
         <w:spacing w:before="360" w:after="120" w:line="360" w:lineRule="auto"/>
@@ -263,7 +455,7 @@
           <w:lang w:val="en-GB" w:eastAsia="nb-NO"/>
           <w14:ligatures w14:val="none"/>
         </w:rPr>
-        <w:t>Exercise 2:</w:t>
+        <w:t xml:space="preserve">Exercise 2: </w:t>
       </w:r>
       <w:r>
         <w:rPr>
@@ -276,7 +468,7 @@
           <w:lang w:val="en-GB" w:eastAsia="nb-NO"/>
           <w14:ligatures w14:val="none"/>
         </w:rPr>
-        <w:t xml:space="preserve"> </w:t>
+        <w:t>Run code</w:t>
       </w:r>
       <w:r>
         <w:rPr>
@@ -289,8 +481,219 @@
           <w:lang w:val="en-GB" w:eastAsia="nb-NO"/>
           <w14:ligatures w14:val="none"/>
         </w:rPr>
-        <w:t>Run code</w:t>
-      </w:r>
+        <w:t xml:space="preserve"> and duration</w:t>
+      </w:r>
+    </w:p>
+    <w:p>
+      <w:pPr>
+        <w:rPr>
+          <w:rFonts w:ascii="Times New Roman" w:hAnsi="Times New Roman" w:cs="Times New Roman"/>
+          <w:sz w:val="28"/>
+          <w:szCs w:val="28"/>
+          <w:lang w:val="en-GB" w:eastAsia="nb-NO"/>
+        </w:rPr>
+      </w:pPr>
+      <w:r>
+        <w:rPr>
+          <w:rFonts w:ascii="Times New Roman" w:hAnsi="Times New Roman" w:cs="Times New Roman"/>
+          <w:sz w:val="28"/>
+          <w:szCs w:val="28"/>
+          <w:lang w:val="en-GB" w:eastAsia="nb-NO"/>
+        </w:rPr>
+        <w:t xml:space="preserve">Subtask 1: Run the code </w:t>
+      </w:r>
+    </w:p>
+    <w:p>
+      <w:pPr>
+        <w:rPr>
+          <w:rFonts w:ascii="Times New Roman" w:hAnsi="Times New Roman" w:cs="Times New Roman"/>
+          <w:lang w:val="en-GB" w:eastAsia="nb-NO"/>
+        </w:rPr>
+      </w:pPr>
+      <w:r>
+        <w:rPr>
+          <w:rFonts w:ascii="Times New Roman" w:hAnsi="Times New Roman" w:cs="Times New Roman"/>
+          <w:lang w:val="en-GB" w:eastAsia="nb-NO"/>
+        </w:rPr>
+        <w:lastRenderedPageBreak/>
+        <w:drawing>
+          <wp:inline distT="0" distB="0" distL="0" distR="0" wp14:anchorId="5950BAE2" wp14:editId="091E5D0D">
+            <wp:extent cx="3915321" cy="2819794"/>
+            <wp:effectExtent l="0" t="0" r="0" b="0"/>
+            <wp:docPr id="1086179254" name="Bilde 1"/>
+            <wp:cNvGraphicFramePr>
+              <a:graphicFrameLocks xmlns:a="http://schemas.openxmlformats.org/drawingml/2006/main" noChangeAspect="1"/>
+            </wp:cNvGraphicFramePr>
+            <a:graphic xmlns:a="http://schemas.openxmlformats.org/drawingml/2006/main">
+              <a:graphicData uri="http://schemas.openxmlformats.org/drawingml/2006/picture">
+                <pic:pic xmlns:pic="http://schemas.openxmlformats.org/drawingml/2006/picture">
+                  <pic:nvPicPr>
+                    <pic:cNvPr id="1086179254" name=""/>
+                    <pic:cNvPicPr/>
+                  </pic:nvPicPr>
+                  <pic:blipFill>
+                    <a:blip r:embed="rId8"/>
+                    <a:stretch>
+                      <a:fillRect/>
+                    </a:stretch>
+                  </pic:blipFill>
+                  <pic:spPr>
+                    <a:xfrm>
+                      <a:off x="0" y="0"/>
+                      <a:ext cx="3915321" cy="2819794"/>
+                    </a:xfrm>
+                    <a:prstGeom prst="rect">
+                      <a:avLst/>
+                    </a:prstGeom>
+                  </pic:spPr>
+                </pic:pic>
+              </a:graphicData>
+            </a:graphic>
+          </wp:inline>
+        </w:drawing>
+      </w:r>
+    </w:p>
+    <w:p>
+      <w:pPr>
+        <w:rPr>
+          <w:rFonts w:ascii="Times New Roman" w:hAnsi="Times New Roman" w:cs="Times New Roman"/>
+          <w:sz w:val="28"/>
+          <w:szCs w:val="28"/>
+          <w:lang w:val="en-GB" w:eastAsia="nb-NO"/>
+        </w:rPr>
+      </w:pPr>
+      <w:r>
+        <w:rPr>
+          <w:rFonts w:ascii="Times New Roman" w:hAnsi="Times New Roman" w:cs="Times New Roman"/>
+          <w:sz w:val="28"/>
+          <w:szCs w:val="28"/>
+          <w:lang w:val="en-GB" w:eastAsia="nb-NO"/>
+        </w:rPr>
+        <w:t>Subtask 2: Duration of run</w:t>
+      </w:r>
+    </w:p>
+    <w:p>
+      <w:pPr>
+        <w:rPr>
+          <w:rFonts w:ascii="Times New Roman" w:hAnsi="Times New Roman" w:cs="Times New Roman"/>
+          <w:lang w:val="en-GB" w:eastAsia="nb-NO"/>
+        </w:rPr>
+      </w:pPr>
+      <w:r>
+        <w:rPr>
+          <w:rFonts w:ascii="Times New Roman" w:hAnsi="Times New Roman" w:cs="Times New Roman"/>
+          <w:lang w:val="en-GB" w:eastAsia="nb-NO"/>
+        </w:rPr>
+        <w:t xml:space="preserve">By adding </w:t>
+      </w:r>
+      <w:proofErr w:type="spellStart"/>
+      <w:r>
+        <w:rPr>
+          <w:rFonts w:ascii="Times New Roman" w:hAnsi="Times New Roman" w:cs="Times New Roman"/>
+          <w:lang w:val="en-GB" w:eastAsia="nb-NO"/>
+        </w:rPr>
+        <w:t>System.currentTimeMillis</w:t>
+      </w:r>
+      <w:proofErr w:type="spellEnd"/>
+      <w:r>
+        <w:rPr>
+          <w:rFonts w:ascii="Times New Roman" w:hAnsi="Times New Roman" w:cs="Times New Roman"/>
+          <w:lang w:val="en-GB" w:eastAsia="nb-NO"/>
+        </w:rPr>
+        <w:t>()</w:t>
+      </w:r>
+      <w:r>
+        <w:rPr>
+          <w:rFonts w:ascii="Times New Roman" w:hAnsi="Times New Roman" w:cs="Times New Roman"/>
+          <w:lang w:val="en-GB" w:eastAsia="nb-NO"/>
+        </w:rPr>
+        <w:t xml:space="preserve"> before and after the for-loop to get </w:t>
+      </w:r>
+      <w:r>
+        <w:rPr>
+          <w:rFonts w:ascii="Times New Roman" w:hAnsi="Times New Roman" w:cs="Times New Roman"/>
+          <w:lang w:val="en-GB" w:eastAsia="nb-NO"/>
+        </w:rPr>
+        <w:t>end time</w:t>
+      </w:r>
+      <w:r>
+        <w:rPr>
+          <w:rFonts w:ascii="Times New Roman" w:hAnsi="Times New Roman" w:cs="Times New Roman"/>
+          <w:lang w:val="en-GB" w:eastAsia="nb-NO"/>
+        </w:rPr>
+        <w:t xml:space="preserve"> – </w:t>
+      </w:r>
+      <w:r>
+        <w:rPr>
+          <w:rFonts w:ascii="Times New Roman" w:hAnsi="Times New Roman" w:cs="Times New Roman"/>
+          <w:lang w:val="en-GB" w:eastAsia="nb-NO"/>
+        </w:rPr>
+        <w:t>start time</w:t>
+      </w:r>
+      <w:r>
+        <w:rPr>
+          <w:rFonts w:ascii="Times New Roman" w:hAnsi="Times New Roman" w:cs="Times New Roman"/>
+          <w:lang w:val="en-GB" w:eastAsia="nb-NO"/>
+        </w:rPr>
+        <w:t xml:space="preserve">, I </w:t>
+      </w:r>
+      <w:r>
+        <w:rPr>
+          <w:rFonts w:ascii="Times New Roman" w:hAnsi="Times New Roman" w:cs="Times New Roman"/>
+          <w:lang w:val="en-GB" w:eastAsia="nb-NO"/>
+        </w:rPr>
+        <w:t>calculated</w:t>
+      </w:r>
+      <w:r>
+        <w:rPr>
+          <w:rFonts w:ascii="Times New Roman" w:hAnsi="Times New Roman" w:cs="Times New Roman"/>
+          <w:lang w:val="en-GB" w:eastAsia="nb-NO"/>
+        </w:rPr>
+        <w:t xml:space="preserve"> the running time. </w:t>
+      </w:r>
+    </w:p>
+    <w:p>
+      <w:pPr>
+        <w:rPr>
+          <w:rFonts w:ascii="Times New Roman" w:hAnsi="Times New Roman" w:cs="Times New Roman"/>
+          <w:u w:val="single"/>
+          <w:lang w:val="en-GB" w:eastAsia="nb-NO"/>
+        </w:rPr>
+      </w:pPr>
+      <w:r>
+        <w:rPr>
+          <w:rFonts w:ascii="Times New Roman" w:hAnsi="Times New Roman" w:cs="Times New Roman"/>
+          <w:u w:val="single"/>
+          <w:lang w:val="en-GB" w:eastAsia="nb-NO"/>
+        </w:rPr>
+        <w:t>Total execution tim</w:t>
+      </w:r>
+      <w:r>
+        <w:rPr>
+          <w:rFonts w:ascii="Times New Roman" w:hAnsi="Times New Roman" w:cs="Times New Roman"/>
+          <w:u w:val="single"/>
+          <w:lang w:val="en-GB" w:eastAsia="nb-NO"/>
+        </w:rPr>
+        <w:t>e</w:t>
+      </w:r>
+      <w:r>
+        <w:rPr>
+          <w:rFonts w:ascii="Times New Roman" w:hAnsi="Times New Roman" w:cs="Times New Roman"/>
+          <w:u w:val="single"/>
+          <w:lang w:val="en-GB" w:eastAsia="nb-NO"/>
+        </w:rPr>
+        <w:t xml:space="preserve">: 1 </w:t>
+      </w:r>
+      <w:proofErr w:type="spellStart"/>
+      <w:r>
+        <w:rPr>
+          <w:rFonts w:ascii="Times New Roman" w:hAnsi="Times New Roman" w:cs="Times New Roman"/>
+          <w:u w:val="single"/>
+          <w:lang w:val="en-GB" w:eastAsia="nb-NO"/>
+        </w:rPr>
+        <w:t>ms</w:t>
+      </w:r>
+      <w:proofErr w:type="spellEnd"/>
     </w:p>
     <w:p>
       <w:pPr>
@@ -321,7 +724,7 @@
           <w:lang w:val="en-GB" w:eastAsia="nb-NO"/>
           <w14:ligatures w14:val="none"/>
         </w:rPr>
-        <w:t>Exercise 3:</w:t>
+        <w:t xml:space="preserve">Exercise 3: </w:t>
       </w:r>
       <w:r>
         <w:rPr>
@@ -334,9 +737,82 @@
           <w:lang w:val="en-GB" w:eastAsia="nb-NO"/>
           <w14:ligatures w14:val="none"/>
         </w:rPr>
-        <w:t xml:space="preserve"> </w:t>
-      </w:r>
-      <w:r>
+        <w:t>Run code and explain</w:t>
+      </w:r>
+    </w:p>
+    <w:p>
+      <w:pPr>
+        <w:rPr>
+          <w:rFonts w:ascii="Times New Roman" w:hAnsi="Times New Roman" w:cs="Times New Roman"/>
+          <w:lang w:val="en-GB" w:eastAsia="nb-NO"/>
+        </w:rPr>
+      </w:pPr>
+      <w:r>
+        <w:rPr>
+          <w:rFonts w:ascii="Times New Roman" w:hAnsi="Times New Roman" w:cs="Times New Roman"/>
+          <w:lang w:val="en-GB" w:eastAsia="nb-NO"/>
+        </w:rPr>
+        <w:t xml:space="preserve">Subtask </w:t>
+      </w:r>
+      <w:r>
+        <w:rPr>
+          <w:rFonts w:ascii="Times New Roman" w:hAnsi="Times New Roman" w:cs="Times New Roman"/>
+          <w:lang w:val="en-GB" w:eastAsia="nb-NO"/>
+        </w:rPr>
+        <w:t>1</w:t>
+      </w:r>
+      <w:r>
+        <w:rPr>
+          <w:rFonts w:ascii="Times New Roman" w:hAnsi="Times New Roman" w:cs="Times New Roman"/>
+          <w:lang w:val="en-GB" w:eastAsia="nb-NO"/>
+        </w:rPr>
+        <w:t xml:space="preserve">: </w:t>
+      </w:r>
+      <w:r>
+        <w:rPr>
+          <w:rFonts w:ascii="Times New Roman" w:hAnsi="Times New Roman" w:cs="Times New Roman"/>
+          <w:lang w:val="en-GB" w:eastAsia="nb-NO"/>
+        </w:rPr>
+        <w:t>Run code</w:t>
+      </w:r>
+    </w:p>
+    <w:p>
+      <w:pPr>
+        <w:rPr>
+          <w:rFonts w:ascii="Times New Roman" w:hAnsi="Times New Roman" w:cs="Times New Roman"/>
+          <w:lang w:val="en-GB" w:eastAsia="nb-NO"/>
+        </w:rPr>
+      </w:pPr>
+      <w:r>
+        <w:rPr>
+          <w:rFonts w:ascii="Times New Roman" w:hAnsi="Times New Roman" w:cs="Times New Roman"/>
+          <w:lang w:val="en-GB" w:eastAsia="nb-NO"/>
+        </w:rPr>
+        <w:t xml:space="preserve">Subtask 2: </w:t>
+      </w:r>
+      <w:r>
+        <w:rPr>
+          <w:rFonts w:ascii="Times New Roman" w:hAnsi="Times New Roman" w:cs="Times New Roman"/>
+          <w:lang w:val="en-GB" w:eastAsia="nb-NO"/>
+        </w:rPr>
+        <w:t>Explain why execution times are different</w:t>
+      </w:r>
+    </w:p>
+    <w:p>
+      <w:pPr>
+        <w:rPr>
+          <w:rFonts w:ascii="Times New Roman" w:hAnsi="Times New Roman" w:cs="Times New Roman"/>
+          <w:lang w:val="en-GB" w:eastAsia="nb-NO"/>
+        </w:rPr>
+      </w:pPr>
+    </w:p>
+    <w:p>
+      <w:pPr>
+        <w:keepNext/>
+        <w:keepLines/>
+        <w:spacing w:before="360" w:after="120" w:line="360" w:lineRule="auto"/>
+        <w:ind w:right="360"/>
+        <w:outlineLvl w:val="0"/>
         <w:rPr>
           <w:rFonts w:ascii="Times New Roman" w:eastAsiaTheme="majorEastAsia" w:hAnsi="Times New Roman" w:cs="Times New Roman"/>
           <w:b/>
@@ -347,16 +823,8 @@
           <w:lang w:val="en-GB" w:eastAsia="nb-NO"/>
           <w14:ligatures w14:val="none"/>
         </w:rPr>
-        <w:t>Run code and explain</w:t>
-      </w:r>
-    </w:p>
-    <w:p>
-      <w:pPr>
-        <w:keepNext/>
-        <w:keepLines/>
-        <w:spacing w:before="360" w:after="120" w:line="360" w:lineRule="auto"/>
-        <w:ind w:right="360"/>
-        <w:outlineLvl w:val="0"/>
+      </w:pPr>
+      <w:r>
         <w:rPr>
           <w:rFonts w:ascii="Times New Roman" w:eastAsiaTheme="majorEastAsia" w:hAnsi="Times New Roman" w:cs="Times New Roman"/>
           <w:b/>
@@ -367,24 +835,12 @@
           <w:lang w:val="en-GB" w:eastAsia="nb-NO"/>
           <w14:ligatures w14:val="none"/>
         </w:rPr>
-      </w:pPr>
-      <w:r>
-        <w:rPr>
-          <w:rFonts w:ascii="Times New Roman" w:eastAsiaTheme="majorEastAsia" w:hAnsi="Times New Roman" w:cs="Times New Roman"/>
-          <w:b/>
-          <w:bCs/>
-          <w:kern w:val="0"/>
-          <w:sz w:val="36"/>
-          <w:szCs w:val="36"/>
-          <w:lang w:val="en-GB" w:eastAsia="nb-NO"/>
-          <w14:ligatures w14:val="none"/>
-        </w:rPr>
         <w:t>Exercise 4: Fix deadlock problem</w:t>
       </w:r>
     </w:p>
     <w:sectPr>
-      <w:headerReference w:type="even" r:id="rId7"/>
-      <w:headerReference w:type="default" r:id="rId8"/>
+      <w:headerReference w:type="even" r:id="rId9"/>
+      <w:headerReference w:type="default" r:id="rId10"/>
       <w:pgSz w:w="11906" w:h="16838"/>
       <w:pgMar w:top="1417" w:right="1417" w:bottom="1417" w:left="1417" w:header="708" w:footer="708" w:gutter="0"/>
       <w:cols w:space="708"/>
@@ -457,6 +913,11 @@
         <w:docPartUnique/>
       </w:docPartObj>
     </w:sdtPr>
+    <w:sdtEndPr>
+      <w:rPr>
+        <w:rStyle w:val="Sidetall"/>
+      </w:rPr>
+    </w:sdtEndPr>
     <w:sdtContent>
       <w:p>
         <w:pPr>
@@ -515,6 +976,11 @@
         <w:docPartUnique/>
       </w:docPartObj>
     </w:sdtPr>
+    <w:sdtEndPr>
+      <w:rPr>
+        <w:rStyle w:val="Sidetall"/>
+      </w:rPr>
+    </w:sdtEndPr>
     <w:sdtContent>
       <w:p>
         <w:pPr>
@@ -2289,7 +2755,7 @@
   <w:style w:type="paragraph" w:default="1" w:styleId="Normal">
     <w:name w:val="Normal"/>
     <w:qFormat/>
-    <w:rsid w:val="003B5735"/>
+    <w:rsid w:val="00725479"/>
   </w:style>
   <w:style w:type="paragraph" w:styleId="Overskrift1">
     <w:name w:val="heading 1"/>
@@ -2506,7 +2972,6 @@
   <w:style w:type="character" w:default="1" w:styleId="Standardskriftforavsnitt">
     <w:name w:val="Default Paragraph Font"/>
     <w:uiPriority w:val="1"/>
-    <w:semiHidden/>
     <w:unhideWhenUsed/>
   </w:style>
   <w:style w:type="table" w:default="1" w:styleId="Vanligtabell">

</xml_diff>